<commit_message>
Replace manuscript body with supplied rewrite
</commit_message>
<xml_diff>
--- a/PrivCloud-Chain_IEEE_Research_Paper.docx
+++ b/PrivCloud-Chain_IEEE_Research_Paper.docx
@@ -285,7 +285,7 @@
     </w:p>
     <w:p>
       <w:r>
-        <w:t>Abstract—Cloud-hosted digital evidence must remain confidential, verifiable, and traceable as it moves between investigators and storage services. This paper presents PrivCloud-Chain, a prototype that combines a FastAPI service, AES-256-GCM authenticated encryption, SHA-256 evidence fingerprints, MinIO object storage, role- and policy-based access checks, and Hyperledger Fabric audit records. Evidence content is stored off-chain as ciphertext, while the ledger records selected metadata and lifecycle events. The workflow registers evidence, checks identity and permissions before retrieval, verifies integrity, and records grants and denials. A supplied Verification Center report records 15 configured checks covering authentication, authorization, encryption, integrity, MinIO, Fabric connectivity, audit history, and an end-to-end workflow; all 15 passed in 38.658 s. We also provide a reproducible 60-record synthetic event corpus and report a separate local SHA-256/AES-GCM primitive microbenchmark. That benchmark excludes the application, object store, database, blockchain, and network. No application-level baseline or ablation measurements were available because the source code was not supplied. The evidence therefore supports functional behavior in one configured run and local cryptographic timing only; it does not establish comparative performance, scalability, comprehensive privacy, or superiority over prior frameworks.</w:t>
+        <w:t>Abstract—Digital evidence stored within the cloud should be kept confidential, verifiable and traceable throughout the investigation. This paper presents a prototype solution that uses FastAPI as a service, AES-256-GCM for authenticated encryption, SHA-256 fingerprints, MinIO for object storage, role and policy-based access, and Hyperledger Fabric for audit trails. It stores the evidence contents off-chain as ciphertext, and stores selected metadata and events within the chain. It provides a workflow for registering evidence, verifying user ID and permissions, verifying integrity, and providing audit of granted and denied accesses. A report was provided from the Verification Centre which shows 15 checks were completed successfully within the configured system. An audit report was also provided containing 60 synthetic events that could be reproduced. Finally, a microbenchmark was carried out on SHA-256 and AES-GCM. This ignored the application, object store, database, blockchain and network. As there was no source code provided, there were no baseline or ablation experiments carried out at the application level. The evidence provided gives us evidence that the application behaves as expected with the configured checks. However, it doesn’t give evidence of any performance improvements, scalability, full data privacy or that it is better than other frameworks.</w:t>
       </w:r>
     </w:p>
     <w:p>
@@ -296,7 +296,7 @@
           <w:i/>
           <w:sz w:val="16"/>
         </w:rPr>
-        <w:t>Keywords—cloud forensics, chain of custody, digital evidence, Hyperledger Fabric, authenticated encryption, access control, MinIO.</w:t>
+        <w:t>Keywords—Cloud Forensics, Chain Of Custody, Digital Evidence, Hyperledger Fabric, Authenticated Encryption, Access Control, MinIO.</w:t>
       </w:r>
     </w:p>
     <w:p>
@@ -314,7 +314,7 @@
           <w:b w:val="0"/>
           <w:i w:val="0"/>
         </w:rPr>
-        <w:t>Cloud platforms generate logs, snapshots, object versions, and service records that may become relevant to an investigation. Preserving such material is difficult because evidence is easy to copy, alter, move across jurisdictions, or lose among multi-tenant services. Investigators must explain where evidence came from, how it was protected, who handled it, and whether the item examined later is the same item collected. NIST defines chain of custody as documenting evidence movement through collection, safeguarding, and analysis, including handlers, times, and transfer purposes [1]. Digital preservation guidance likewise treats integrity verification and custody documentation as core evidence-handling practices [2].</w:t>
+        <w:t>Digital evidence can be created within the cloud such as logs, snapshots, object versions and service records. Storing this data can be challenging as it can easily be copied, altered, moved across legal jurisdictions and become lost among multiple tenants. Investigators will need to understand where the evidence was sourced from, how it was kept secure, who had accessed it and confirm that it is the same piece of evidence being investigated. NIST define chain of custody as “a detailed record of the location of evidence from the time it was collected until it is presented in court. This includes who had access to the evidence, at what time, and why they had transferred the evidence [1]. Guidance on digital preservation recommends that verifying integrity and keeping audit trails are core parts of handling digital evidence [2].</w:t>
       </w:r>
     </w:p>
     <w:p>
@@ -324,7 +324,7 @@
           <w:b w:val="0"/>
           <w:i w:val="0"/>
         </w:rPr>
-        <w:t>A storage system can protect availability and access, but its privileged operators may control both evidence and its audit database. A distributed ledger can make history independently verifiable among participating organizations, yet cannot prove that the original evidence was collected correctly or that an authorized endpoint behaved honestly. Encryption protects file contents but does not hide every associated fact: object identifiers, timestamps, sizes, access frequency, and ledger metadata may remain visible. Strong claims require an explicit threat model and tests of metadata exposure as well as encryption.</w:t>
+        <w:t>While a storage system can be used to keep evidence secure, the administrators have privileged access and will have control over the evidence and audit database. In a distributed ledger, evidence can be independently verified between different organisations. However, it cannot provide evidence that the original evidence was collected correctly and that authorised endpoints were honest. By using encryption, we can keep the contents of a file secure. However, this does not mean all facts are hidden. For example, object IDs, timestamps, size, number of accesses and metadata will still be known. To make strong claims, there needs to be a defined threat model and evidence that the metadata is not being exposed and encryption is being used.</w:t>
       </w:r>
     </w:p>
     <w:p>
@@ -334,7 +334,7 @@
           <w:b w:val="0"/>
           <w:i w:val="0"/>
         </w:rPr>
-        <w:t>PrivCloud-Chain is a prototype for evidence registration and custody tracking. A web dashboard submits requests to a FastAPI backend. The service authenticates users through bcrypt-protected credentials and JWT sessions, applies role and policy checks, computes SHA-256 fingerprints, encrypts evidence using AES-256-GCM, and stores ciphertext in MinIO. A Fabric client and Go chaincode record registration metadata and access decisions on a permissioned channel. The application is designed to return plaintext only after authorization and integrity checks succeed. We treat the Verification Center as evidence about implemented scenarios, rather than proof of complete security.</w:t>
+        <w:t>PrivCloud-Chain is a prototype solution for registering evidence and maintaining chain of custody. The application provides a dashboard for submitting requests to the FastAPI backend. Users are authenticated using bcrypt protected credentials and JWT sessions. The application then carries out role and policy based checks, calculates SHA-256 fingerprints and encrypts the evidence using AES-256-GCM. The ciphertext is then stored in MinIO. A Fabric client and Go chaincode is then used to store metadata and access decisions during registration in a permissioned channel. The application has been designed so that plaintext will only be returned once it has passed authorisation and integrity checks. The Verification Centre can be considered as evidence of the scenarios implemented within the application.</w:t>
       </w:r>
     </w:p>
     <w:p>
@@ -344,7 +344,7 @@
           <w:b w:val="0"/>
           <w:i w:val="0"/>
         </w:rPr>
-        <w:t>The contribution is a concrete, testable prototype workflow and its verification suite. The integrated workflow connects encrypted off-chain storage to permissioned ledger events and checks successful and denied access paths. The supplied audit report documents 15 successful checks in its configured environment. This work does not claim that blockchain improves performance or privacy over existing systems: no comparable baseline, workload sweep, ablation, or metadata-leakage evaluation was supplied. The remainder of the paper reviews related work, defines the threat model, presents the architecture and formalization, describes the implementation and tests, analyzes the bounded results, and proposes a reproducible evaluation plan.</w:t>
+        <w:t>This provides a tangible prototype with verification. The workflow has been integrated to ensure encryption, off-chain storage, and permissioned chain events are being recorded. The audit report shows all 15 checks have been passed within the configured system. There was no evidence that the blockchain is providing performance improvements or better data privacy. No baseline, workload sweep, ablation or metadata exposure were provided. This section will look at the related work, threat model, architecture, implementation and testing. An analysis of the limited results will also be performed. Finally, a plan to evaluate this will be proposed.</w:t>
       </w:r>
     </w:p>
     <w:p>
@@ -360,7 +360,7 @@
         <w:pStyle w:val="Heading2"/>
       </w:pPr>
       <w:r>
-        <w:t>A. Evidence preservation and cloud forensics</w:t>
+        <w:t>A. Evidence Preservation &amp; Cloud Forensics</w:t>
       </w:r>
     </w:p>
     <w:p>
@@ -370,7 +370,7 @@
           <w:b w:val="0"/>
           <w:i w:val="0"/>
         </w:rPr>
-        <w:t>Evidence handling requires more than file storage. A custody record should connect collection, safeguarding, transfer, analysis, and presentation to identifiable actors and times [1], [2]. Cryptographic digests detect changes between observations, but only when the reference digest and its handling are trustworthy. A hash cannot establish that a log was complete at acquisition, identify a collector without authenticated records, or prove that a provider exposed every relevant source. Operational procedures and acquisition context remain necessary.</w:t>
+        <w:t>Evidence can be stored in a system but the chain of custody should be recorded to ensure evidence is tracked from being collected, secured, accessed and presented. This should be done with identifiable people and timestamps [1], [2]. Cryptographic digests can be used but this relies on the digest and handling being trusted. Hashes cannot be used to confirm that logs were complete when collected, who has collected them (without authenticated records) or evidence that all relevant sources have been provided by the provider. Procedures should still be followed.</w:t>
       </w:r>
     </w:p>
     <w:p>
@@ -380,7 +380,7 @@
           <w:b w:val="0"/>
           <w:i w:val="0"/>
         </w:rPr>
-        <w:t>Cloud forensics adds provider-controlled interfaces, distributed locations, service-level agreements, tenant isolation, and volatility. Ruan et al. discuss how cloud characteristics complicate forensic acquisition and analysis [3]. Zawoad and Hasan proposed Secure-Logging-as-a-Service (SecLaaS) to preserve cloud log confidentiality and availability to investigators [4]. These works show that acquisition and provider trust are broader challenges than custody recording alone.</w:t>
+        <w:t>Cloud forensics introduces additional complexity as there are many elements to consider such as interfaces controlled by providers, distributed locations, SLAs, tenant isolation and volatility. Ruan et al discuss how the nature of the cloud can cause issues with collecting and analysing evidence [3]. Zawoad and Hasan propose a new solution (Secure-Logging-as-a-Service) to keep logs secure within the cloud and make them available to investigators [4]. This demonstrates how collecting evidence and trusting the provider can be an issue.</w:t>
       </w:r>
     </w:p>
     <w:p>
@@ -388,7 +388,7 @@
         <w:pStyle w:val="Heading2"/>
       </w:pPr>
       <w:r>
-        <w:t>B. Blockchain provenance</w:t>
+        <w:t>B. Blockchain Provenance</w:t>
       </w:r>
     </w:p>
     <w:p>
@@ -398,7 +398,7 @@
           <w:b w:val="0"/>
           <w:i w:val="0"/>
         </w:rPr>
-        <w:t>Lone and Mir proposed Forensic-Chain, a blockchain-based chain-of-custody proof of concept using Hyperledger Composer and evaluated its performance [5]. B-CoC models evidence custody events on a blockchain to improve traceability [6]. BCFL integrates permissioned blockchain logging into a cloud ecosystem and studies acquisition and preservation of cloud logs [7]. Designs differ in ledger platform, storage, actor model, and evaluation method; superiority claims require comparable workloads and configurations.</w:t>
+        <w:t>Lone and Mir propose a proof of concept solution using blockchain to provide chain of custody evidence using Hyperledger Composer. The performance was evaluated [5]. B-CoC provides evidence of custody events using a blockchain to increase traceability [6]. BCFL provides a permissioned blockchain logging system for the cloud, evaluating evidence collection and preservation [7]. Different designs have been used, however claims of superiority require the workloads to be comparable.</w:t>
       </w:r>
     </w:p>
     <w:p>
@@ -408,7 +408,7 @@
           <w:b w:val="0"/>
           <w:i w:val="0"/>
         </w:rPr>
-        <w:t>Hyperledger Fabric is permissioned: organizations and peers participate under membership and endorsement policies. Transaction processing separates proposal execution and endorsement, ordering, and peer validation/commit [8]. Fabric supports multi-organization workflows without public cryptocurrency, but depends on correct identity management, policy configuration, and governance. Raft ordering is crash-fault tolerant and must not be described as Byzantine-fault tolerant against malicious orderers [8].</w:t>
+        <w:t>Hyperledger Fabric is a permissioned blockchain. Organisations and peers are involved in the blockchain with membership and endorsement policies. Transactions are processed by first executing proposals, then endorsements, ordering and validation by peers [8]. Multiple organisations can be involved using Fabric without having to use public cryptocurrency. This relies on correct identification management, policies and governance. The ordering uses Raft and is crash fault tolerant. It is not Byzantine-fault tolerant as malicious orderers are not a concern [8].</w:t>
       </w:r>
     </w:p>
     <w:p>
@@ -416,7 +416,7 @@
         <w:pStyle w:val="Heading2"/>
       </w:pPr>
       <w:r>
-        <w:t>C. Cryptographic building blocks and research gap</w:t>
+        <w:t>C. Cryptographic Primitives</w:t>
       </w:r>
     </w:p>
     <w:p>
@@ -426,7 +426,7 @@
           <w:b w:val="0"/>
           <w:i w:val="0"/>
         </w:rPr>
-        <w:t>SHA-256 is a standardized digest function intended to reveal message changes when a trusted reference digest is available [9]. AES-GCM combines encryption with authentication [10]. Correct use requires nonce uniqueness and sound key management. It can detect ciphertext or authenticated-data modification at decryption, but cannot compensate for leaked keys, compromised endpoints, incorrect authorization, or a malicious administrator.</w:t>
+        <w:t>SHA-256 is a standardised hashing function. This is used to identify any changes in the message if a trusted digest is available [9]. AES-GCM provides encryption and authentication. Nonces must be unique and key management must be correct. During decryption any modifications to ciphertext or authenticated data can be detected. However, this will not help if keys have been leaked, endpoints have been compromised, authorisation has been invalid or a malicious admin.</w:t>
       </w:r>
     </w:p>
     <w:p>
@@ -436,7 +436,7 @@
           <w:b w:val="0"/>
           <w:i w:val="0"/>
         </w:rPr>
-        <w:t>Blockchain custody ledgers and cloud forensic logging are established directions. The defensible gap for this project is not the absence of earlier frameworks. Rather, this work can be evaluated as an implementation-level integration of authentication, role/policy decisions, authenticated encryption, object storage, and Fabric-backed lifecycle audit in one dashboard workflow. The testable contribution claimed here is demonstrating and documenting that integrated workflow and its negative access path through an automated suite. Whether it improves security, privacy, or performance over prior systems remains an open empirical question.</w:t>
+        <w:t>Blockchain custody, evidence logging within the cloud, are well known areas of research. However, the gap in this project is not the lack of previous frameworks. It can be evaluated as an integration at the application level providing authentication, role/policies, authenticated encryption, object storage and lifecycle audit using Fabric. This provides tangible evidence of the application working as expected with the integration and negative path using an automated suite. Whether it provides improved security, privacy or performance over previous systems is an open question.</w:t>
       </w:r>
     </w:p>
     <w:p>
@@ -446,7 +446,7 @@
           <w:b w:val="0"/>
           <w:i/>
         </w:rPr>
-        <w:t>TABLE I. Qualitative scope comparison; not a controlled ranking.</w:t>
+        <w:t>Table I shows a qualitative comparison between solutions.</w:t>
       </w:r>
     </w:p>
     <w:tbl>
@@ -495,7 +495,7 @@
                 <w:rFonts w:ascii="Times New Roman" w:hAnsi="Times New Roman"/>
                 <w:sz w:val="15"/>
               </w:rPr>
-              <w:t>Prior approaches</w:t>
+              <w:t>Previous approaches</w:t>
             </w:r>
           </w:p>
         </w:tc>
@@ -549,7 +549,7 @@
                 <w:rFonts w:ascii="Times New Roman" w:hAnsi="Times New Roman"/>
                 <w:sz w:val="15"/>
               </w:rPr>
-              <w:t>Off-chain storage or provider logs [4], [7]</w:t>
+              <w:t>Off-chain or Provider logs [4], [7]</w:t>
             </w:r>
           </w:p>
         </w:tc>
@@ -566,7 +566,7 @@
                 <w:rFonts w:ascii="Times New Roman" w:hAnsi="Times New Roman"/>
                 <w:sz w:val="15"/>
               </w:rPr>
-              <w:t>MinIO ciphertext; plaintext exclusion reported</w:t>
+              <w:t>Ciphertext stored in MinIO. Plaintext not allowed.</w:t>
             </w:r>
           </w:p>
         </w:tc>
@@ -602,7 +602,7 @@
                 <w:rFonts w:ascii="Times New Roman" w:hAnsi="Times New Roman"/>
                 <w:sz w:val="15"/>
               </w:rPr>
-              <w:t>Blockchain lifecycle events [5]–[7]</w:t>
+              <w:t>Blockchain events [5]-[7]</w:t>
             </w:r>
           </w:p>
         </w:tc>
@@ -619,7 +619,7 @@
                 <w:rFonts w:ascii="Times New Roman" w:hAnsi="Times New Roman"/>
                 <w:sz w:val="15"/>
               </w:rPr>
-              <w:t>Fabric registration, access, custody events</w:t>
+              <w:t>Fabric custody, access, registration events.</w:t>
             </w:r>
           </w:p>
         </w:tc>
@@ -638,7 +638,7 @@
                 <w:rFonts w:ascii="Times New Roman" w:hAnsi="Times New Roman"/>
                 <w:sz w:val="15"/>
               </w:rPr>
-              <w:t>Access control</w:t>
+              <w:t>Access Control</w:t>
             </w:r>
           </w:p>
         </w:tc>
@@ -655,7 +655,7 @@
                 <w:rFonts w:ascii="Times New Roman" w:hAnsi="Times New Roman"/>
                 <w:sz w:val="15"/>
               </w:rPr>
-              <w:t>Varies by framework</w:t>
+              <w:t>Varies by framework.</w:t>
             </w:r>
           </w:p>
         </w:tc>
@@ -672,7 +672,7 @@
                 <w:rFonts w:ascii="Times New Roman" w:hAnsi="Times New Roman"/>
                 <w:sz w:val="15"/>
               </w:rPr>
-              <w:t>JWT plus application policy; Investigator/Guest paths</w:t>
+              <w:t>JWT &amp; Application policies. Investigator/Guest access.</w:t>
             </w:r>
           </w:p>
         </w:tc>
@@ -708,7 +708,7 @@
                 <w:rFonts w:ascii="Times New Roman" w:hAnsi="Times New Roman"/>
                 <w:sz w:val="15"/>
               </w:rPr>
-              <w:t>System-specific experiments</w:t>
+              <w:t>System specific</w:t>
             </w:r>
           </w:p>
         </w:tc>
@@ -725,7 +725,7 @@
                 <w:rFonts w:ascii="Times New Roman" w:hAnsi="Times New Roman"/>
                 <w:sz w:val="15"/>
               </w:rPr>
-              <w:t>15 functional checks; no comparative performance data</w:t>
+              <w:t>15 checks. No performance comparisons.</w:t>
             </w:r>
           </w:p>
         </w:tc>
@@ -747,7 +747,7 @@
           <w:b w:val="0"/>
           <w:i w:val="0"/>
         </w:rPr>
-        <w:t>Let evidence object E be bytes collected from a cloud source and M its case metadata. The system should preserve confidentiality of E at rest, detect changes to the registered object, enforce access rules, and provide an ordered record of custody and access events. Actors are Investigators who register and request evidence, Auditors who inspect history, Administrators who configure users and services, and Guests whose retrieval is restricted. Exact privileges must be bound to deployed policies; role labels alone do not guarantee enforcement.</w:t>
+        <w:t>An evidence object, E, has been collected from a cloud source. Metadata has been collected relating to the case, M. The system should provide confidentiality to the evidence object, identification of changes to the registered object, and control access. There are different actors to consider such as Investigators (registrations and requests), Auditors (checking history), Administrators (configuring users and services) and Guests (restricted access). The exact privileges will depend on the policies set up.</w:t>
       </w:r>
     </w:p>
     <w:p>
@@ -755,7 +755,7 @@
         <w:pStyle w:val="Heading2"/>
       </w:pPr>
       <w:r>
-        <w:t>A. Adversary and assumptions</w:t>
+        <w:t>A. Threat Model</w:t>
       </w:r>
     </w:p>
     <w:p>
@@ -765,7 +765,7 @@
           <w:b w:val="0"/>
           <w:i w:val="0"/>
         </w:rPr>
-        <w:t>The adversary may be an unauthenticated caller, an authenticated low-privilege user, or a party able to modify a stored object. The supplied suite reports rejection of tampered or expired JWTs and user-ID or role spoofing. We assume cryptographic libraries behave as specified, initial acquisition is performed by an authorized process, the key is not disclosed, Fabric identities and endorsement policies are correctly configured, and the supplied audit report corresponds to the described deployment. These are assumptions, not properties established by 15 checks.</w:t>
+        <w:t>The threat could come from an unauthenticated caller, authenticated low privilege user, or someone who can modify the stored object. The suite provided shows that tampered or expired JWTs have been rejected. Spoofed user ID / role are checked. We assume that cryptographic libraries will work as intended, the initial evidence collection will be done by an authorised process, the key will not be revealed, the Fabric identities and endorsement policies will be correctly configured and the audit report provided matches the configured deployment.</w:t>
       </w:r>
     </w:p>
     <w:p>
@@ -775,7 +775,7 @@
           <w:b w:val="0"/>
           <w:i w:val="0"/>
         </w:rPr>
-        <w:t>Out of scope are privileged administrator compromise, collusion among endorsing organizations, host malware capturing plaintext or keys, denial of service, malicious provider behavior before registration, compromised time sources, jurisdiction-specific admissibility, and side-channel attacks. MinIO object encryption does not prevent size or access-pattern leakage. Ledger metadata may expose case identifiers, event frequency, pseudonyms, or timestamps. Evaluation must enumerate persisted fields and observers; mitigations may include minimizing ledger data, pseudonymous identifiers, private data collections, and encrypted off-chain metadata.</w:t>
+        <w:t>Outside of this we are not considering that the administrator may be compromised, organisations may collude on endorsement, malware on host, denial of service, malicious behaviour by the provider prior to registration, incorrect time sources, jurisdiction specific evidence acceptability and side-channel attacks. The evidence will be encrypted in MinIO but cannot be guaranteed that size or access pattern won’t be revealed. Metadata may be exposed in the ledger including case identifiers, frequency of events, pseudonyms or timestamps. This should be identified during evaluation. Mitigations could include reducing data stored in the ledger, pseudonyms, private data sets and encrypted metadata off-chain.</w:t>
       </w:r>
     </w:p>
     <w:p>
@@ -785,7 +785,7 @@
           <w:b w:val="0"/>
           <w:i/>
         </w:rPr>
-        <w:t>TABLE II. Threat requirements and current evidence.</w:t>
+        <w:t>Table II shows the threat requirements and evidence.</w:t>
       </w:r>
     </w:p>
     <w:tbl>
@@ -852,7 +852,7 @@
                 <w:rFonts w:ascii="Times New Roman" w:hAnsi="Times New Roman"/>
                 <w:sz w:val="15"/>
               </w:rPr>
-              <w:t>Evidence / limitation</w:t>
+              <w:t>Evidence / Limitation</w:t>
             </w:r>
           </w:p>
         </w:tc>
@@ -888,7 +888,7 @@
                 <w:rFonts w:ascii="Times New Roman" w:hAnsi="Times New Roman"/>
                 <w:sz w:val="15"/>
               </w:rPr>
-              <w:t>AES-256-GCM; encrypted object</w:t>
+              <w:t>AES-256-GCM Encryption. Encrypted Object.</w:t>
             </w:r>
           </w:p>
         </w:tc>
@@ -905,7 +905,7 @@
                 <w:rFonts w:ascii="Times New Roman" w:hAnsi="Times New Roman"/>
                 <w:sz w:val="15"/>
               </w:rPr>
-              <w:t>Encryption/plaintext checks reported; key lifecycle and metadata not evaluated</w:t>
+              <w:t>Encryption / Plaintext checks. Key lifecycle and metadata not evaluated.</w:t>
             </w:r>
           </w:p>
         </w:tc>
@@ -941,7 +941,7 @@
                 <w:rFonts w:ascii="Times New Roman" w:hAnsi="Times New Roman"/>
                 <w:sz w:val="15"/>
               </w:rPr>
-              <w:t>SHA-256 and GCM tag</w:t>
+              <w:t>SHA-256 &amp; GCM Tag.</w:t>
             </w:r>
           </w:p>
         </w:tc>
@@ -958,7 +958,7 @@
                 <w:rFonts w:ascii="Times New Roman" w:hAnsi="Times New Roman"/>
                 <w:sz w:val="15"/>
               </w:rPr>
-              <w:t>Digest and ciphertext-tamper checks reported; source authenticity not established</w:t>
+              <w:t>Digest / Ciphertext checks. Source not known to be authentic.</w:t>
             </w:r>
           </w:p>
         </w:tc>
@@ -977,7 +977,7 @@
                 <w:rFonts w:ascii="Times New Roman" w:hAnsi="Times New Roman"/>
                 <w:sz w:val="15"/>
               </w:rPr>
-              <w:t>Access control</w:t>
+              <w:t>Access Control</w:t>
             </w:r>
           </w:p>
         </w:tc>
@@ -994,7 +994,7 @@
                 <w:rFonts w:ascii="Times New Roman" w:hAnsi="Times New Roman"/>
                 <w:sz w:val="15"/>
               </w:rPr>
-              <w:t>JWT and role/policy</w:t>
+              <w:t>JWT &amp; Role / Policies.</w:t>
             </w:r>
           </w:p>
         </w:tc>
@@ -1011,7 +1011,7 @@
                 <w:rFonts w:ascii="Times New Roman" w:hAnsi="Times New Roman"/>
                 <w:sz w:val="15"/>
               </w:rPr>
-              <w:t>Investigator grant, Guest denial, spoofing checks reported</w:t>
+              <w:t>Investigator access allowed. Guest access denied. Spoofing checks.</w:t>
             </w:r>
           </w:p>
         </w:tc>
@@ -1030,7 +1030,7 @@
                 <w:rFonts w:ascii="Times New Roman" w:hAnsi="Times New Roman"/>
                 <w:sz w:val="15"/>
               </w:rPr>
-              <w:t>Auditability</w:t>
+              <w:t>Audit</w:t>
             </w:r>
           </w:p>
         </w:tc>
@@ -1047,7 +1047,7 @@
                 <w:rFonts w:ascii="Times New Roman" w:hAnsi="Times New Roman"/>
                 <w:sz w:val="15"/>
               </w:rPr>
-              <w:t>Fabric events</w:t>
+              <w:t>Fabric Events.</w:t>
             </w:r>
           </w:p>
         </w:tc>
@@ -1064,7 +1064,7 @@
                 <w:rFonts w:ascii="Times New Roman" w:hAnsi="Times New Roman"/>
                 <w:sz w:val="15"/>
               </w:rPr>
-              <w:t>Transaction/history checks reported; governance not evaluated</w:t>
+              <w:t>Transaction / History checks. Governance not evaluated.</w:t>
             </w:r>
           </w:p>
         </w:tc>
@@ -1100,7 +1100,7 @@
                 <w:rFonts w:ascii="Times New Roman" w:hAnsi="Times New Roman"/>
                 <w:sz w:val="15"/>
               </w:rPr>
-              <w:t>API/database/MinIO/Fabric health</w:t>
+              <w:t>API / DB / MinIO / Fabric Health.</w:t>
             </w:r>
           </w:p>
         </w:tc>
@@ -1117,7 +1117,7 @@
                 <w:rFonts w:ascii="Times New Roman" w:hAnsi="Times New Roman"/>
                 <w:sz w:val="15"/>
               </w:rPr>
-              <w:t>Health reported at test time only</w:t>
+              <w:t>Health reported.</w:t>
             </w:r>
           </w:p>
         </w:tc>
@@ -1137,7 +1137,7 @@
         <w:pStyle w:val="Heading2"/>
       </w:pPr>
       <w:r>
-        <w:t>A. Architecture and data flow</w:t>
+        <w:t>A. Architecture</w:t>
       </w:r>
     </w:p>
     <w:p>
@@ -1147,7 +1147,7 @@
           <w:b w:val="0"/>
           <w:i w:val="0"/>
         </w:rPr>
-        <w:t>The design separates user interface, application control plane, object store, database, and ledger. The HTML/CSS/JavaScript dashboard submits to FastAPI. The backend verifies JWT claims, applies access rules, performs cryptographic operations, writes encrypted objects to MinIO, and invokes the Fabric client/gateway bridge. PostgreSQL and/or SQLite hold application data depending on configuration. MinIO stores large evidence payloads off-chain. Fabric peers, an ordering service, and Go chaincode named “forensics” maintain ledger state and events. The exact database backend and ordering configuration used for each run should be reported.</w:t>
+        <w:t>The application has been designed with a separation between the UI, application, object store, database and ledger. Requests are sent to the FastAPI backend from the HTML/CSS/JS dashboard. The backend checks JWT claims, enforces access policies, carries out cryptographic processes, stores encrypted objects in MinIO, and communicates with the Fabric client &amp; gateway bridge. The application stores data in a PostgreSQL / SQLite database depending on configuration. MinIO stores the large evidence objects off-chain. Fabric peers, ordering service and Go chaincode (forensics) maintains the ledger state and events. The exact database and ordering service should be reported.</w:t>
       </w:r>
     </w:p>
     <w:p>
@@ -1157,7 +1157,7 @@
           <w:b w:val="0"/>
           <w:i w:val="0"/>
         </w:rPr>
-        <w:t>At registration, the backend receives evidence and case metadata, computes a digest from submitted bytes, encrypts the payload using an AES-GCM key and unique nonce, uploads ciphertext and required parameters to MinIO, and submits the fingerprint and selected metadata to Fabric. At retrieval, it authenticates the user, evaluates policy, records the access result, loads ciphertext only for an approved request, authenticates decryption, and returns plaintext only after successful verification. If policy denies access or GCM authentication fails, plaintext is withheld. The supplied tests report this behavior; source-code review is needed to confirm exact transaction ordering and all exception paths.</w:t>
+        <w:t>During registration, the backend receives evidence and case metadata. It calculates the digest of the received bytes. Then the payload is encrypted using the AES-GCM key and unique nonce. The ciphertext is uploaded along with required parameters to MinIO. The fingerprint is submitted along with selected metadata to the Fabric. During retrieval, the user is authenticated. Policies are enforced. The access result is recorded. Only ciphertext will be loaded for an approved request. The ciphertext will be authenticated. Only plaintext will be returned if it passes verification. If policies fail or GCM authentication fails, plaintext will not be returned. This can be seen in the tests provided. The source code would need to be reviewed to confirm the exact order of transactions and any exceptions.</w:t>
       </w:r>
     </w:p>
     <w:p>
@@ -1220,7 +1220,7 @@
           <w:b w:val="0"/>
           <w:i w:val="0"/>
         </w:rPr>
-        <w:t>Large evidence files remain off-chain to avoid replicating them to every ledger participant. The ledger stores a digest and lifecycle information for later comparison. Metadata on a shared ledger may remain visible even when the file is encrypted. The precise fields and visibility rules must be documented before making privacy claims.</w:t>
+        <w:t>Large evidence files are stored off-chain to prevent duplication across all participants in the ledger. Digest and life cycle information is stored on the ledger. Metadata may still be visible on the shared ledger. This should be defined clearly to make privacy claims.</w:t>
       </w:r>
     </w:p>
     <w:p>
@@ -1228,7 +1228,7 @@
         <w:pStyle w:val="Heading2"/>
       </w:pPr>
       <w:r>
-        <w:t>B. Cryptographic and policy formulation</w:t>
+        <w:t>B. Cryptographic &amp; Policy Design</w:t>
       </w:r>
     </w:p>
     <w:p>
@@ -1238,7 +1238,7 @@
           <w:b w:val="0"/>
           <w:i w:val="0"/>
         </w:rPr>
-        <w:t>For evidence bytes E, the registration fingerprint is:</w:t>
+        <w:t>The fingerprint for registration of evidence bytes, E, would be:</w:t>
       </w:r>
     </w:p>
     <w:p>
@@ -1261,7 +1261,7 @@
           <w:b w:val="0"/>
           <w:i w:val="0"/>
         </w:rPr>
-        <w:t>For secret key K, unique nonce N, optional associated data A, and plaintext E, authenticated encryption yields ciphertext C and tag T:</w:t>
+        <w:t>AES-GCM encryption using a secret key, K, unique nonce, N, optional associated data, A, and plaintext, E would produce ciphertext and tag:</w:t>
       </w:r>
     </w:p>
     <w:p>
@@ -1284,7 +1284,7 @@
           <w:b w:val="0"/>
           <w:i w:val="0"/>
         </w:rPr>
-        <w:t>Decryption returns E only if the tag validates:</w:t>
+        <w:t>Decryption will return plaintext, E, only if the tag is valid:</w:t>
       </w:r>
     </w:p>
     <w:p>
@@ -1307,7 +1307,7 @@
           <w:b w:val="0"/>
           <w:i w:val="0"/>
         </w:rPr>
-        <w:t>Whether associated data is used is not specified in the supplied material. A fresh nonce must be used for each encryption under a key, and keys must be protected and rotated under a documented policy [10]. Key source, storage, backup, rotation, access, and compromise response must be reported before claiming key-management security.</w:t>
+        <w:t>Associated data may or may not be used. A new nonce must be used each time encryption happens with a key. Keys must be protected and rotated according to a documented policy [10]. The source, storage, backup, rotation, access and response to any compromise should be reported to demonstrate secure key management.</w:t>
       </w:r>
     </w:p>
     <w:p>
@@ -1317,7 +1317,7 @@
           <w:b w:val="0"/>
           <w:i w:val="0"/>
         </w:rPr>
-        <w:t>A custody event e_i may be represented as (id_i, actor_i, action_i, time_i, h_E, context_i). A hash-linked event model would compute:</w:t>
+        <w:t>A custody event, e_i can be represented as (id_i, actor_i, action_i, time_i, h_E, context_i). A hash chain would calculate:</w:t>
       </w:r>
     </w:p>
     <w:p>
@@ -1340,7 +1340,7 @@
           <w:b w:val="0"/>
           <w:i w:val="0"/>
         </w:rPr>
-        <w:t>The project description says Fabric stores event history but does not confirm this event-level formula is implemented in chaincode. Equation (4) is a design model, not a verified implementation fact. Fabric block history and endorsement/commit provide ledger-level ordering and validation under network policy [8]; do not claim extra event linkage without code evidence.</w:t>
+        <w:t>Fabric is used to store event history. The above equation may not be implemented in the chaincode. It is a model of how the evidence would be stored. Fabric has block history and endorsement/commit to provide ordering and validation of the ledger according to network policy [8]. It cannot be claimed to provide additional chaining of events without evidence from the code.</w:t>
       </w:r>
     </w:p>
     <w:p>
@@ -1350,7 +1350,7 @@
           <w:b w:val="0"/>
           <w:i w:val="0"/>
         </w:rPr>
-        <w:t>Let u be an authenticated user, r(u) the verified role, a the action, and x the evidence record. The authorization function is:</w:t>
+        <w:t>If a user has been authenticated and has a role, r(u), the authorisation would be:</w:t>
       </w:r>
     </w:p>
     <w:p>
@@ -1373,7 +1373,7 @@
           <w:b w:val="0"/>
           <w:i w:val="0"/>
         </w:rPr>
-        <w:t>Decisions must use trusted claims and server-side policy, not a user-supplied role or identifier. Denial should return no evidence bytes and be auditable, subject to ledger availability.</w:t>
+        <w:t>Claims must be trusted and policies enforced on the server. The role should not be provided by the user. If denied, no evidence bytes should be returned. This should be audited.</w:t>
       </w:r>
     </w:p>
     <w:p>
@@ -1381,7 +1381,7 @@
         <w:pStyle w:val="Heading2"/>
       </w:pPr>
       <w:r>
-        <w:t>C. Registration and retrieval algorithms</w:t>
+        <w:t>C. Algorithms for Registration &amp; Retrieval</w:t>
       </w:r>
     </w:p>
     <w:p>
@@ -1391,9 +1391,7 @@
           <w:b w:val="0"/>
           <w:i/>
         </w:rPr>
-        <w:t>Algorithm 1: RegisterEvidence(E,M,u)</w:t>
-        <w:br/>
-        <w:t>1) Verify JWT and registration role. 2) Compute h_E ← SHA-256(E). 3) Generate nonce N and encrypt (C,T) ← AES-GCM(K,N,E,A). 4) Store (C,N,T) in MinIO under an opaque identifier. 5) Submit selected metadata, h_E, object reference, and registration event to Fabric. 6) Persist application reference and return status.</w:t>
+        <w:t>Algorithm 1: RegisterEvidence(E,M,u)1. Check JWT and registration role. 2. Calculate h_E = SHA-256(E). 3. Generate unique nonce, N. Encrypt (C,T) = AES-GCM(K,N,E,A). 4. Store (C,N,T) in MinIO with an opaque ID. 5. Submit selected metadata, h_E, object reference and registration event to Fabric. 6. Store application reference. Return status.</w:t>
       </w:r>
     </w:p>
     <w:p>
@@ -1403,9 +1401,7 @@
           <w:b w:val="0"/>
           <w:i/>
         </w:rPr>
-        <w:t>Algorithm 2: RetrieveEvidence(id,u)</w:t>
-        <w:br/>
-        <w:t>1) Verify JWT signature, expiry, subject, and role. 2) Evaluate server-side policy. 3) Record grant or denial under the audit policy. 4) If denied, return an error with no evidence bytes. 5) Retrieve ciphertext and cryptographic parameters. 6) Authenticate/decrypt; on tag failure, withhold plaintext and raise an integrity alert. 7) Compare resulting evidence fingerprint with the registered digest. 8) Return evidence only if all checks succeed.</w:t>
+        <w:t>Algorithm 2: RetrieveEvidence(id,u)1. Check JWT signature, expiry, subject and role. 2. Enforce policies on server. 3. Record access decision based on audit policy. 4. If denied return error with no evidence bytes. 5. Retrieve ciphertext and cryptographic parameters. 6. Authenticate/decrypt. If tag fails, don’t return plaintext and raise integrity alert. 7. Check evidence fingerprint. 8. Return evidence if all checks passed.</w:t>
       </w:r>
     </w:p>
     <w:p>
@@ -1413,7 +1409,7 @@
         <w:pStyle w:val="Heading2"/>
       </w:pPr>
       <w:r>
-        <w:t>D. Privacy scope</w:t>
+        <w:t>D. Data Privacy</w:t>
       </w:r>
     </w:p>
     <w:p>
@@ -1423,7 +1419,7 @@
           <w:b w:val="0"/>
           <w:i w:val="0"/>
         </w:rPr>
-        <w:t>The framework protects evidence contents at rest if AES-GCM is correctly used and keys remain secret. Architecture alone does not provide anonymity, unlinkability, differential privacy, secure multi-party analysis, or zero-knowledge proofs. Role identifiers and case metadata may be visible to ledger participants. A privacy audit should inventory fields in the ledger, database, object metadata, application logs, and browser responses, identify observers, and test inference from metadata and access patterns. Key compromise and endpoint compromise are distinct from storage tampering.</w:t>
+        <w:t>Evidence contents will be kept private if AES-GCM is used correctly and keys are kept secret. The architecture does not provide anonymity, unlinkability, differential privacy, secure multi-party analysis, or zero knowledge proofs. Role IDs and case metadata may be visible to participants on the ledger. An audit should be performed to identify what fields are stored in the ledger, database, object metadata, application logs and browser responses. Who can see this and if any inference can be made from metadata and access patterns. Key and endpoint compromise are separate to evidence tampering.</w:t>
       </w:r>
     </w:p>
     <w:p>
@@ -1431,7 +1427,7 @@
         <w:pStyle w:val="Heading1"/>
       </w:pPr>
       <w:r>
-        <w:t>V. IMPLEMENTATION AND EXPERIMENTAL SETUP</w:t>
+        <w:t>V. IMPLEMENTATION &amp; EXPERIMENTAL DESIGN</w:t>
       </w:r>
     </w:p>
     <w:p>
@@ -1441,7 +1437,7 @@
           <w:b w:val="0"/>
           <w:i w:val="0"/>
         </w:rPr>
-        <w:t>The project description identifies Python FastAPI, an HTML/CSS/JavaScript dashboard, bcrypt and JWT, AES-256-GCM, SHA-256, MinIO S3-compatible storage, Hyperledger Fabric 2.5, and Go chaincode named “forensics.” The supplied report lists Fabric channel “mychannel,” chaincode version 2.2, sequence 4, and a Verification Center. PostgreSQL and/or SQLite are reported depending on component configuration. We do not infer machine specifications, library versions, nonce size, token lifetime, organization count, endorsement policy, MinIO version, network topology, or evidence-size distribution.</w:t>
+        <w:t>The project has been implemented using Python FastAPI. A dashboard was created using HTML/CSS/JS. Authentication was provided using bcrypt and JWT. AES-256-GCM and SHA-256 were used for cryptography. MinIO was used for object storage and Hyperledger Fabric v2.5 for the blockchain. Go chaincode was used with name ‘forensics’. The report states a channel called ‘mychannel’ was used, chaincode version 2.2, sequence 4 and Verification Centre. Depending on the component, PostgreSQL or SQLite was used. No conclusions can be drawn about the machine, libraries, nonce size, token lifetime, number of organisations, endorsement policy, MinIO version, network topology or evidence size distribution.</w:t>
       </w:r>
     </w:p>
     <w:p>
@@ -1451,7 +1447,7 @@
           <w:b w:val="0"/>
           <w:i/>
         </w:rPr>
-        <w:t>TABLE III. Reported implementation configuration.</w:t>
+        <w:t>Table III shows the configuration used.</w:t>
       </w:r>
     </w:p>
     <w:tbl>
@@ -1499,7 +1495,7 @@
                 <w:rFonts w:ascii="Times New Roman" w:hAnsi="Times New Roman"/>
                 <w:sz w:val="15"/>
               </w:rPr>
-              <w:t>Reported configuration</w:t>
+              <w:t>Configuration</w:t>
             </w:r>
           </w:p>
         </w:tc>
@@ -1518,7 +1514,7 @@
                 <w:rFonts w:ascii="Times New Roman" w:hAnsi="Times New Roman"/>
                 <w:sz w:val="15"/>
               </w:rPr>
-              <w:t>API and UI</w:t>
+              <w:t>API/UI</w:t>
             </w:r>
           </w:p>
         </w:tc>
@@ -1535,7 +1531,7 @@
                 <w:rFonts w:ascii="Times New Roman" w:hAnsi="Times New Roman"/>
                 <w:sz w:val="15"/>
               </w:rPr>
-              <w:t>FastAPI; HTML, CSS, JavaScript</w:t>
+              <w:t>FastAPI, HTML, CSS, JS.</w:t>
             </w:r>
           </w:p>
         </w:tc>
@@ -1571,7 +1567,7 @@
                 <w:rFonts w:ascii="Times New Roman" w:hAnsi="Times New Roman"/>
                 <w:sz w:val="15"/>
               </w:rPr>
-              <w:t>bcrypt; JWT</w:t>
+              <w:t>bcrypt, JWT.</w:t>
             </w:r>
           </w:p>
         </w:tc>
@@ -1607,7 +1603,7 @@
                 <w:rFonts w:ascii="Times New Roman" w:hAnsi="Times New Roman"/>
                 <w:sz w:val="15"/>
               </w:rPr>
-              <w:t>AES-256-GCM; SHA-256</w:t>
+              <w:t>AES-256-GCM, SHA-256.</w:t>
             </w:r>
           </w:p>
         </w:tc>
@@ -1626,7 +1622,7 @@
                 <w:rFonts w:ascii="Times New Roman" w:hAnsi="Times New Roman"/>
                 <w:sz w:val="15"/>
               </w:rPr>
-              <w:t>Object storage</w:t>
+              <w:t>Object Storage</w:t>
             </w:r>
           </w:p>
         </w:tc>
@@ -1643,7 +1639,7 @@
                 <w:rFonts w:ascii="Times New Roman" w:hAnsi="Times New Roman"/>
                 <w:sz w:val="15"/>
               </w:rPr>
-              <w:t>MinIO; bucket forensic-evidence</w:t>
+              <w:t>MinIO, Bucket Name: forensic-evidence.</w:t>
             </w:r>
           </w:p>
         </w:tc>
@@ -1679,7 +1675,7 @@
                 <w:rFonts w:ascii="Times New Roman" w:hAnsi="Times New Roman"/>
                 <w:sz w:val="15"/>
               </w:rPr>
-              <w:t>Fabric 2.5; channel mychannel; Go chaincode forensics</w:t>
+              <w:t>Fabric v2.5, Channel: mychannel, Go Chaincode: forensics.</w:t>
             </w:r>
           </w:p>
         </w:tc>
@@ -1715,7 +1711,7 @@
                 <w:rFonts w:ascii="Times New Roman" w:hAnsi="Times New Roman"/>
                 <w:sz w:val="15"/>
               </w:rPr>
-              <w:t>Version 2.2; sequence 4, as reported</w:t>
+              <w:t>v2.2, Sequence: 4.</w:t>
             </w:r>
           </w:p>
         </w:tc>
@@ -1751,7 +1747,7 @@
                 <w:rFonts w:ascii="Times New Roman" w:hAnsi="Times New Roman"/>
                 <w:sz w:val="15"/>
               </w:rPr>
-              <w:t>PostgreSQL and/or SQLite by component</w:t>
+              <w:t>PostgreSQL or SQLite depending on component.</w:t>
             </w:r>
           </w:p>
         </w:tc>
@@ -1787,7 +1783,7 @@
                 <w:rFonts w:ascii="Times New Roman" w:hAnsi="Times New Roman"/>
                 <w:sz w:val="15"/>
               </w:rPr>
-              <w:t>15 checks; 38.658 s aggregate duration</w:t>
+              <w:t>15 checks, 38.658s.</w:t>
             </w:r>
           </w:p>
         </w:tc>
@@ -1799,7 +1795,7 @@
         <w:pStyle w:val="Heading2"/>
       </w:pPr>
       <w:r>
-        <w:t>A. Verification methodology</w:t>
+        <w:t>A. Verification</w:t>
       </w:r>
     </w:p>
     <w:p>
@@ -1809,7 +1805,7 @@
           <w:b w:val="0"/>
           <w:i w:val="0"/>
         </w:rPr>
-        <w:t>The supplied report groups tests into functional, security, cryptographic, and integration behavior. Functional checks cover registration, authorized retrieval, denial, and history. Security checks cover token tampering and expiry, identity/role spoofing, Guest requests, and plaintext withholding. Cryptographic checks cover encryption/decryption, deterministic SHA-256 output, and modified-ciphertext rejection. Integration checks cover MinIO, Fabric connectivity and transactions, chain-of-custody records, service health, and the lifecycle. Raw outputs, repeated trials, per-case timings, file sizes, workload scripts, and independent replication instructions were not supplied.</w:t>
+        <w:t>The report shows tests have been carried out for functional, security, cryptographic and integration aspects. Functional tests have been carried out for registration, authorisation, denial and history. Security tests have been carried out for tampered tokens, expired tokens, spoofed user ID / role, Guest access and no plaintext returned. Cryptographic tests have been carried out for encryption/decryption, deterministic SHA-256 and ciphertext tamper. Integration tests have been carried out for MinIO, Fabric connection, transactions, chain of custody, health and lifecycle. The raw results, repeated tests, timings for each case, evidence sizes, scripts for workloads and instructions to repeat tests were not provided.</w:t>
       </w:r>
     </w:p>
     <w:p>
@@ -1819,7 +1815,7 @@
           <w:b w:val="0"/>
           <w:i/>
         </w:rPr>
-        <w:t>TABLE IV. Verification cases as reported by the project audit material.</w:t>
+        <w:t>Table IV shows the test cases carried out.</w:t>
       </w:r>
     </w:p>
     <w:tbl>
@@ -1868,7 +1864,7 @@
                 <w:rFonts w:ascii="Times New Roman" w:hAnsi="Times New Roman"/>
                 <w:sz w:val="15"/>
               </w:rPr>
-              <w:t>Reported verification check</w:t>
+              <w:t>Test</w:t>
             </w:r>
           </w:p>
         </w:tc>
@@ -1886,7 +1882,7 @@
                 <w:rFonts w:ascii="Times New Roman" w:hAnsi="Times New Roman"/>
                 <w:sz w:val="15"/>
               </w:rPr>
-              <w:t>Outcome</w:t>
+              <w:t>Result</w:t>
             </w:r>
           </w:p>
         </w:tc>
@@ -1922,7 +1918,7 @@
                 <w:rFonts w:ascii="Times New Roman" w:hAnsi="Times New Roman"/>
                 <w:sz w:val="15"/>
               </w:rPr>
-              <w:t>Authentication and JWT lifecycle</w:t>
+              <w:t>Authentication &amp; JWT lifecycle.</w:t>
             </w:r>
           </w:p>
         </w:tc>
@@ -1939,7 +1935,7 @@
                 <w:rFonts w:ascii="Times New Roman" w:hAnsi="Times New Roman"/>
                 <w:sz w:val="15"/>
               </w:rPr>
-              <w:t>PASS</w:t>
+              <w:t>PASS.</w:t>
             </w:r>
           </w:p>
         </w:tc>
@@ -1975,7 +1971,7 @@
                 <w:rFonts w:ascii="Times New Roman" w:hAnsi="Times New Roman"/>
                 <w:sz w:val="15"/>
               </w:rPr>
-              <w:t>Role and user-ID spoofing</w:t>
+              <w:t>Spoofed Role &amp; User ID.</w:t>
             </w:r>
           </w:p>
         </w:tc>
@@ -1992,7 +1988,7 @@
                 <w:rFonts w:ascii="Times New Roman" w:hAnsi="Times New Roman"/>
                 <w:sz w:val="15"/>
               </w:rPr>
-              <w:t>PASS</w:t>
+              <w:t>PASS.</w:t>
             </w:r>
           </w:p>
         </w:tc>
@@ -2028,7 +2024,7 @@
                 <w:rFonts w:ascii="Times New Roman" w:hAnsi="Times New Roman"/>
                 <w:sz w:val="15"/>
               </w:rPr>
-              <w:t>Investigator access</w:t>
+              <w:t>Investigator.</w:t>
             </w:r>
           </w:p>
         </w:tc>
@@ -2045,7 +2041,7 @@
                 <w:rFonts w:ascii="Times New Roman" w:hAnsi="Times New Roman"/>
                 <w:sz w:val="15"/>
               </w:rPr>
-              <w:t>PASS</w:t>
+              <w:t>PASS.</w:t>
             </w:r>
           </w:p>
         </w:tc>
@@ -2081,7 +2077,7 @@
                 <w:rFonts w:ascii="Times New Roman" w:hAnsi="Times New Roman"/>
                 <w:sz w:val="15"/>
               </w:rPr>
-              <w:t>Guest access denial</w:t>
+              <w:t>Guest Denied.</w:t>
             </w:r>
           </w:p>
         </w:tc>
@@ -2098,7 +2094,7 @@
                 <w:rFonts w:ascii="Times New Roman" w:hAnsi="Times New Roman"/>
                 <w:sz w:val="15"/>
               </w:rPr>
-              <w:t>PASS</w:t>
+              <w:t>PASS.</w:t>
             </w:r>
           </w:p>
         </w:tc>
@@ -2134,7 +2130,7 @@
                 <w:rFonts w:ascii="Times New Roman" w:hAnsi="Times New Roman"/>
                 <w:sz w:val="15"/>
               </w:rPr>
-              <w:t>Plaintext withholding</w:t>
+              <w:t>No Plaintext Returned.</w:t>
             </w:r>
           </w:p>
         </w:tc>
@@ -2151,7 +2147,7 @@
                 <w:rFonts w:ascii="Times New Roman" w:hAnsi="Times New Roman"/>
                 <w:sz w:val="15"/>
               </w:rPr>
-              <w:t>PASS</w:t>
+              <w:t>PASS.</w:t>
             </w:r>
           </w:p>
         </w:tc>
@@ -2187,7 +2183,7 @@
                 <w:rFonts w:ascii="Times New Roman" w:hAnsi="Times New Roman"/>
                 <w:sz w:val="15"/>
               </w:rPr>
-              <w:t>AES-GCM encryption/decryption</w:t>
+              <w:t>AES-GCM Encryption / Decryption.</w:t>
             </w:r>
           </w:p>
         </w:tc>
@@ -2204,7 +2200,7 @@
                 <w:rFonts w:ascii="Times New Roman" w:hAnsi="Times New Roman"/>
                 <w:sz w:val="15"/>
               </w:rPr>
-              <w:t>PASS</w:t>
+              <w:t>PASS.</w:t>
             </w:r>
           </w:p>
         </w:tc>
@@ -2240,7 +2236,7 @@
                 <w:rFonts w:ascii="Times New Roman" w:hAnsi="Times New Roman"/>
                 <w:sz w:val="15"/>
               </w:rPr>
-              <w:t>SHA-256 digest</w:t>
+              <w:t>SHA-256 Digest.</w:t>
             </w:r>
           </w:p>
         </w:tc>
@@ -2257,7 +2253,7 @@
                 <w:rFonts w:ascii="Times New Roman" w:hAnsi="Times New Roman"/>
                 <w:sz w:val="15"/>
               </w:rPr>
-              <w:t>PASS</w:t>
+              <w:t>PASS.</w:t>
             </w:r>
           </w:p>
         </w:tc>
@@ -2293,7 +2289,7 @@
                 <w:rFonts w:ascii="Times New Roman" w:hAnsi="Times New Roman"/>
                 <w:sz w:val="15"/>
               </w:rPr>
-              <w:t>MinIO encrypted object/plaintext exclusion</w:t>
+              <w:t>MinIO encrypted object &amp; no plaintext.</w:t>
             </w:r>
           </w:p>
         </w:tc>
@@ -2310,7 +2306,7 @@
                 <w:rFonts w:ascii="Times New Roman" w:hAnsi="Times New Roman"/>
                 <w:sz w:val="15"/>
               </w:rPr>
-              <w:t>PASS</w:t>
+              <w:t>PASS.</w:t>
             </w:r>
           </w:p>
         </w:tc>
@@ -2346,7 +2342,7 @@
                 <w:rFonts w:ascii="Times New Roman" w:hAnsi="Times New Roman"/>
                 <w:sz w:val="15"/>
               </w:rPr>
-              <w:t>Ciphertext tamper detection</w:t>
+              <w:t>Ciphertext Tamper.</w:t>
             </w:r>
           </w:p>
         </w:tc>
@@ -2363,7 +2359,7 @@
                 <w:rFonts w:ascii="Times New Roman" w:hAnsi="Times New Roman"/>
                 <w:sz w:val="15"/>
               </w:rPr>
-              <w:t>PASS</w:t>
+              <w:t>PASS.</w:t>
             </w:r>
           </w:p>
         </w:tc>
@@ -2399,7 +2395,7 @@
                 <w:rFonts w:ascii="Times New Roman" w:hAnsi="Times New Roman"/>
                 <w:sz w:val="15"/>
               </w:rPr>
-              <w:t>Fabric connectivity</w:t>
+              <w:t>Fabric Connectivity.</w:t>
             </w:r>
           </w:p>
         </w:tc>
@@ -2416,7 +2412,7 @@
                 <w:rFonts w:ascii="Times New Roman" w:hAnsi="Times New Roman"/>
                 <w:sz w:val="15"/>
               </w:rPr>
-              <w:t>PASS</w:t>
+              <w:t>PASS.</w:t>
             </w:r>
           </w:p>
         </w:tc>
@@ -2452,7 +2448,7 @@
                 <w:rFonts w:ascii="Times New Roman" w:hAnsi="Times New Roman"/>
                 <w:sz w:val="15"/>
               </w:rPr>
-              <w:t>Evidence registration transaction</w:t>
+              <w:t>Evidence Registration Transaction.</w:t>
             </w:r>
           </w:p>
         </w:tc>
@@ -2469,7 +2465,7 @@
                 <w:rFonts w:ascii="Times New Roman" w:hAnsi="Times New Roman"/>
                 <w:sz w:val="15"/>
               </w:rPr>
-              <w:t>PASS</w:t>
+              <w:t>PASS.</w:t>
             </w:r>
           </w:p>
         </w:tc>
@@ -2505,7 +2501,7 @@
                 <w:rFonts w:ascii="Times New Roman" w:hAnsi="Times New Roman"/>
                 <w:sz w:val="15"/>
               </w:rPr>
-              <w:t>Fabric grants and denials</w:t>
+              <w:t>Fabric Authorised / Denied.</w:t>
             </w:r>
           </w:p>
         </w:tc>
@@ -2522,7 +2518,7 @@
                 <w:rFonts w:ascii="Times New Roman" w:hAnsi="Times New Roman"/>
                 <w:sz w:val="15"/>
               </w:rPr>
-              <w:t>PASS</w:t>
+              <w:t>PASS.</w:t>
             </w:r>
           </w:p>
         </w:tc>
@@ -2558,7 +2554,7 @@
                 <w:rFonts w:ascii="Times New Roman" w:hAnsi="Times New Roman"/>
                 <w:sz w:val="15"/>
               </w:rPr>
-              <w:t>Custody history retrieval</w:t>
+              <w:t>Custody History.</w:t>
             </w:r>
           </w:p>
         </w:tc>
@@ -2575,7 +2571,7 @@
                 <w:rFonts w:ascii="Times New Roman" w:hAnsi="Times New Roman"/>
                 <w:sz w:val="15"/>
               </w:rPr>
-              <w:t>PASS</w:t>
+              <w:t>PASS.</w:t>
             </w:r>
           </w:p>
         </w:tc>
@@ -2611,7 +2607,7 @@
                 <w:rFonts w:ascii="Times New Roman" w:hAnsi="Times New Roman"/>
                 <w:sz w:val="15"/>
               </w:rPr>
-              <w:t>Database, MinIO, Fabric health</w:t>
+              <w:t>Database / MinIO / Fabric Health.</w:t>
             </w:r>
           </w:p>
         </w:tc>
@@ -2628,7 +2624,7 @@
                 <w:rFonts w:ascii="Times New Roman" w:hAnsi="Times New Roman"/>
                 <w:sz w:val="15"/>
               </w:rPr>
-              <w:t>PASS</w:t>
+              <w:t>PASS.</w:t>
             </w:r>
           </w:p>
         </w:tc>
@@ -2664,7 +2660,7 @@
                 <w:rFonts w:ascii="Times New Roman" w:hAnsi="Times New Roman"/>
                 <w:sz w:val="15"/>
               </w:rPr>
-              <w:t>End-to-end evidence lifecycle</w:t>
+              <w:t>End-to-end evidence lifecycle.</w:t>
             </w:r>
           </w:p>
         </w:tc>
@@ -2681,7 +2677,7 @@
                 <w:rFonts w:ascii="Times New Roman" w:hAnsi="Times New Roman"/>
                 <w:sz w:val="15"/>
               </w:rPr>
-              <w:t>PASS</w:t>
+              <w:t>PASS.</w:t>
             </w:r>
           </w:p>
         </w:tc>
@@ -2693,22 +2689,22 @@
         <w:pStyle w:val="Heading2"/>
       </w:pPr>
       <w:r>
-        <w:t>B. Metrics and validity</w:t>
+        <w:t>B. Metrics &amp; Validity</w:t>
       </w:r>
     </w:p>
     <w:p>
       <w:r>
-        <w:t>The observed functional pass fraction is P/T = 15/15 = 1.00 (100%) for the supplied run, with a total suite duration of 38.658 s. This is an aggregate duration, not upload latency, transaction latency, throughput, or per-file processing time. The checks share services and fixtures and are not independent samples. With one aggregate run and no trial-level observations, a confidence interval or significance test cannot be computed for the Verification Center results.</w:t>
+        <w:t>The functional tests passed at 100% (P/T = 15/15 = 1.00). The suite took 38.658s to complete. This is the total time taken to complete all of the tests. Not latency to upload, transaction, throughput or per file. The tests all use the same services and fixtures so are not independent samples. No confidence interval or significance can be calculated for the results from the Verification Centre as only one run was carried out.</w:t>
       </w:r>
     </w:p>
     <w:p>
       <w:r>
-        <w:t>A small reproducible system-test corpus is now included with this package. It contains 60 generated fictional events: 20 normal, 20 access-denied, and 20 tamper-alert cases, with a manifest and a deterministic generator. The 70/15/15 stratified labels are bookkeeping for test coverage, not machine-learning train/test data. The corpus contains no collected case evidence and should not be described as a representative forensic dataset. Its synthetic origin, schema, generation seed, split, and limitations are documented in the dataset card.</w:t>
+        <w:t>A small set of test data has been added to this package. This consists of 60 synthetic fictional events. There are 20 normal events, 20 denied access events and 20 tamper alerts. This has been provided with a manifest and deterministic generator. The 70/15/15 labelling has been applied for ease of test coverage. This is not used for train/test data for Machine Learning. No evidence has been collected for cases. This should not be considered as representative of a forensic dataset. This has been synthetically generated. It has been documented in the dataset card including schema, seed, split and limitations.</w:t>
       </w:r>
     </w:p>
     <w:p>
       <w:r>
-        <w:t>Three application-level baselines and four ablations are specified in the experiment protocol, but remain unmeasured because the project source was unavailable. The baselines isolate centralized SQL auditing, a centralized hash-linked audit log, and Fabric registration without on-chain access decisions. The ablations remove AES-GCM, Fabric, on-chain access events, or role/policy enforcement in an isolated synthetic-data test instance. A matched comparison should pin software and source revisions, use the same host, workload, object store, cryptographic settings, and concurrency, and preserve raw per-operation results. Report median and p95 latency with uncertainty, throughput, resource use, storage growth, unauthorized retrievals, and tamper detection. Do not disable controls in a live system.</w:t>
+        <w:t>The experiment has defined 3 baselines and 4 ablations at the application layer. However, these have not been measured as the source for this project was not available. The baselines separate the audit to a centralised SQL database, audit log using hash chaining and Fabric registration without on-chain access decisions. The ablations remove AES-GCM, Fabric, on-chain access decisions or role/policy enforcement. All tests should be carried out with matching software, source versions, same host, workload, object store, cryptographic settings and concurrency. Raw results should be recorded for each operation. Median and p95 latency should be reported. Throughput, resources, storage increase, unauthorised access and tamper detection should be reported. Controls should not be disabled in a live system.</w:t>
       </w:r>
     </w:p>
     <w:p>
@@ -2724,7 +2720,7 @@
         <w:pStyle w:val="Heading2"/>
       </w:pPr>
       <w:r>
-        <w:t>A. Reported results</w:t>
+        <w:t>A. Results</w:t>
       </w:r>
     </w:p>
     <w:p>
@@ -2734,7 +2730,7 @@
           <w:b w:val="0"/>
           <w:i w:val="0"/>
         </w:rPr>
-        <w:t>The supplied Verification Center report records 15 total checks, 15 passed, zero failed, zero blocked, zero pending, and total time 38.658 s. The dashboard rounds the displayed time to 38.7 s. The test cases cover expected positive and negative paths: Investigator access, Guest denial, withholding evidence on denial, GCM rejection after ciphertext modification, MinIO object storage, and Fabric registration/access/history operations. The report describes four chronological records in the tested custody-history scenario.</w:t>
+        <w:t>The verification centre report provided shows 15 checks were carried out. 15 were passed, 0 failed, 0 blocked and 0 pending. The total time taken was 38.658s. The dashboard rounds this to 38.7s. Test cases have been carried out for expected positive and negative outcomes. This includes investigator access, guest denied, evidence not returned on denial, GCM rejection on tampered ciphertext, MinIO object stored, and Fabric registration, access and history. Four records have been recorded during the custody history scenario.</w:t>
       </w:r>
     </w:p>
     <w:p>
@@ -2797,7 +2793,7 @@
           <w:b w:val="0"/>
           <w:i/>
         </w:rPr>
-        <w:t>TABLE V. Single supplied verification run.</w:t>
+        <w:t>Table V shows the information from the single verification run.</w:t>
       </w:r>
     </w:p>
     <w:tbl>
@@ -2883,7 +2879,7 @@
                 <w:rFonts w:ascii="Times New Roman" w:hAnsi="Times New Roman"/>
                 <w:sz w:val="15"/>
               </w:rPr>
-              <w:t>Configured checks</w:t>
+              <w:t>Configured Checks</w:t>
             </w:r>
           </w:p>
         </w:tc>
@@ -2917,7 +2913,7 @@
                 <w:rFonts w:ascii="Times New Roman" w:hAnsi="Times New Roman"/>
                 <w:sz w:val="15"/>
               </w:rPr>
-              <w:t>Suite size</w:t>
+              <w:t>Number of checks in suite.</w:t>
             </w:r>
           </w:p>
         </w:tc>
@@ -2936,7 +2932,7 @@
                 <w:rFonts w:ascii="Times New Roman" w:hAnsi="Times New Roman"/>
                 <w:sz w:val="15"/>
               </w:rPr>
-              <w:t>Passed/failed/blocked</w:t>
+              <w:t>Passed / Failed / Blocked</w:t>
             </w:r>
           </w:p>
         </w:tc>
@@ -2953,7 +2949,7 @@
                 <w:rFonts w:ascii="Times New Roman" w:hAnsi="Times New Roman"/>
                 <w:sz w:val="15"/>
               </w:rPr>
-              <w:t>15/0/0</w:t>
+              <w:t>15 / 0 / 0</w:t>
             </w:r>
           </w:p>
         </w:tc>
@@ -2970,7 +2966,7 @@
                 <w:rFonts w:ascii="Times New Roman" w:hAnsi="Times New Roman"/>
                 <w:sz w:val="15"/>
               </w:rPr>
-              <w:t>Outcomes in the reported run</w:t>
+              <w:t>Results of tests carried out.</w:t>
             </w:r>
           </w:p>
         </w:tc>
@@ -2989,7 +2985,7 @@
                 <w:rFonts w:ascii="Times New Roman" w:hAnsi="Times New Roman"/>
                 <w:sz w:val="15"/>
               </w:rPr>
-              <w:t>Pass fraction</w:t>
+              <w:t>Pass %</w:t>
             </w:r>
           </w:p>
         </w:tc>
@@ -3023,7 +3019,7 @@
                 <w:rFonts w:ascii="Times New Roman" w:hAnsi="Times New Roman"/>
                 <w:sz w:val="15"/>
               </w:rPr>
-              <w:t>15/15 in one run</w:t>
+              <w:t>15 passed in 1 run.</w:t>
             </w:r>
           </w:p>
         </w:tc>
@@ -3042,7 +3038,7 @@
                 <w:rFonts w:ascii="Times New Roman" w:hAnsi="Times New Roman"/>
                 <w:sz w:val="15"/>
               </w:rPr>
-              <w:t>Suite duration</w:t>
+              <w:t>Suite Duration</w:t>
             </w:r>
           </w:p>
         </w:tc>
@@ -3059,7 +3055,7 @@
                 <w:rFonts w:ascii="Times New Roman" w:hAnsi="Times New Roman"/>
                 <w:sz w:val="15"/>
               </w:rPr>
-              <w:t>38.658 s</w:t>
+              <w:t>38.658s</w:t>
             </w:r>
           </w:p>
         </w:tc>
@@ -3076,7 +3072,7 @@
                 <w:rFonts w:ascii="Times New Roman" w:hAnsi="Times New Roman"/>
                 <w:sz w:val="15"/>
               </w:rPr>
-              <w:t>Whole-suite duration only</w:t>
+              <w:t>Duration of all checks in suite.</w:t>
             </w:r>
           </w:p>
         </w:tc>
@@ -3095,7 +3091,7 @@
                 <w:rFonts w:ascii="Times New Roman" w:hAnsi="Times New Roman"/>
                 <w:sz w:val="15"/>
               </w:rPr>
-              <w:t>History scenario</w:t>
+              <w:t>History Scenario</w:t>
             </w:r>
           </w:p>
         </w:tc>
@@ -3112,7 +3108,7 @@
                 <w:rFonts w:ascii="Times New Roman" w:hAnsi="Times New Roman"/>
                 <w:sz w:val="15"/>
               </w:rPr>
-              <w:t>4 records</w:t>
+              <w:t>4 Records</w:t>
             </w:r>
           </w:p>
         </w:tc>
@@ -3129,7 +3125,7 @@
                 <w:rFonts w:ascii="Times New Roman" w:hAnsi="Times New Roman"/>
                 <w:sz w:val="15"/>
               </w:rPr>
-              <w:t>Reported tested history</w:t>
+              <w:t>Records during history scenario.</w:t>
             </w:r>
           </w:p>
         </w:tc>
@@ -3141,572 +3137,13 @@
         <w:pStyle w:val="Heading2"/>
       </w:pPr>
       <w:r>
-        <w:t>B. Local cryptographic primitive microbenchmark</w:t>
+        <w:t>B. Local Microbenchmark</w:t>
       </w:r>
     </w:p>
     <w:p>
       <w:pPr/>
       <w:r>
-        <w:t>A separate benchmark ran SHA-256 and AES-256-GCM locally with three warmups and 30 measured repetitions at 1 KiB, 64 KiB, 1 MiB, and 10 MiB. At 10 MiB, median SHA-256 time was 5.532 ms (p95 5.977 ms), median AES-GCM encryption was 5.119 ms, median decryption was 5.732 ms, and median encrypt/decrypt round-trip time was 10.991 ms (p95 12.511 ms). All 30 modified-ciphertext trials per size were rejected and decrypted outputs matched their inputs. The run used Windows 11, Python 3.12.14, and cryptography 50.0.2; host details and raw values are in the accompanying metadata and CSV. These timings measure local primitives only: they exclude FastAPI, MinIO, Fabric, the database, network transfer, and any baseline. They must not be interpreted as end-to-end system performance.</w:t>
-      </w:r>
-    </w:p>
-    <w:p>
-      <w:pPr>
-        <w:pStyle w:val="Heading2"/>
-      </w:pPr>
-      <w:r>
-        <w:t>C. Interpretation</w:t>
-      </w:r>
-    </w:p>
-    <w:p>
-      <w:r>
-        <w:rPr>
-          <w:rFonts w:ascii="Times New Roman" w:hAnsi="Times New Roman" w:eastAsia="Times New Roman"/>
-          <w:b w:val="0"/>
-          <w:i w:val="0"/>
-        </w:rPr>
-        <w:t>The narrow conclusion is that the integrated deployment satisfied the assertions encoded in the supplied Verification Center run. The suite includes grant and denial paths and exercises connected MinIO and Fabric services rather than only isolated functions. The ciphertext-tamper test indicates that the tested GCM path rejected a modified ciphertext. These are useful functional results for the demonstrated workflow.</w:t>
-      </w:r>
-    </w:p>
-    <w:p>
-      <w:r>
-        <w:rPr>
-          <w:rFonts w:ascii="Times New Roman" w:hAnsi="Times New Roman" w:eastAsia="Times New Roman"/>
-          <w:b w:val="0"/>
-          <w:i w:val="0"/>
-        </w:rPr>
-        <w:t>The result does not quantify comparative benefit or scalability. Without baselines, file-size and concurrency sweeps, repeated observations, and per-test timings, performance and uncertainty cannot be estimated. A 100% result means only that the included assertions passed in this run; it does not mean the system is 100% secure.</w:t>
-      </w:r>
-    </w:p>
-    <w:p>
-      <w:r>
-        <w:rPr>
-          <w:rFonts w:ascii="Times New Roman" w:hAnsi="Times New Roman" w:eastAsia="Times New Roman"/>
-          <w:b w:val="0"/>
-          <w:i w:val="0"/>
-        </w:rPr>
-        <w:t>The result also does not establish comprehensive privacy. AES-GCM can protect contents under correct key and nonce management, while application and ledger metadata may remain observable. The report does not enumerate ledger fields or test metadata inference, and key storage and rotation are unspecified. “Privacy-preserving” is therefore a design objective here, not a comprehensively measured property.</w:t>
-      </w:r>
-    </w:p>
-    <w:p>
-      <w:pPr>
-        <w:pStyle w:val="Heading2"/>
-      </w:pPr>
-      <w:r>
-        <w:t>D. Follow-up experiments</w:t>
-      </w:r>
-    </w:p>
-    <w:p>
-      <w:r>
-        <w:t>TABLE VI. Experiments needed to support broader claims.</w:t>
-      </w:r>
-    </w:p>
-    <w:tbl>
-      <w:tblPr>
-        <w:tblStyle w:val="TableGrid"/>
-        <w:tblW w:type="auto" w:w="0"/>
-        <w:jc w:val="center"/>
-        <w:tblLayout w:type="fixed"/>
-        <w:tblLook w:firstColumn="1" w:firstRow="1" w:lastColumn="0" w:lastRow="0" w:noHBand="0" w:noVBand="1" w:val="04A0"/>
-      </w:tblPr>
-      <w:tblGrid>
-        <w:gridCol w:w="1037"/>
-        <w:gridCol w:w="2232"/>
-        <w:gridCol w:w="1699"/>
-      </w:tblGrid>
-      <w:tr>
-        <w:tc>
-          <w:tcPr>
-            <w:tcW w:type="dxa" w:w="1037"/>
-            <w:shd w:fill="D9E2F3"/>
-          </w:tcPr>
-          <w:p>
-            <w:pPr>
-              <w:spacing w:after="20"/>
-            </w:pPr>
-            <w:r>
-              <w:rPr>
-                <w:rFonts w:ascii="Times New Roman" w:hAnsi="Times New Roman"/>
-                <w:sz w:val="15"/>
-              </w:rPr>
-              <w:t>Study</w:t>
-            </w:r>
-          </w:p>
-        </w:tc>
-        <w:tc>
-          <w:tcPr>
-            <w:tcW w:type="dxa" w:w="2232"/>
-            <w:shd w:fill="D9E2F3"/>
-          </w:tcPr>
-          <w:p>
-            <w:pPr>
-              <w:spacing w:after="20"/>
-            </w:pPr>
-            <w:r>
-              <w:rPr>
-                <w:rFonts w:ascii="Times New Roman" w:hAnsi="Times New Roman"/>
-                <w:sz w:val="15"/>
-              </w:rPr>
-              <w:t>Protocol</w:t>
-            </w:r>
-          </w:p>
-        </w:tc>
-        <w:tc>
-          <w:tcPr>
-            <w:tcW w:type="dxa" w:w="1699"/>
-            <w:shd w:fill="D9E2F3"/>
-          </w:tcPr>
-          <w:p>
-            <w:pPr>
-              <w:spacing w:after="20"/>
-            </w:pPr>
-            <w:r>
-              <w:rPr>
-                <w:rFonts w:ascii="Times New Roman" w:hAnsi="Times New Roman"/>
-                <w:sz w:val="15"/>
-              </w:rPr>
-              <w:t>Report</w:t>
-            </w:r>
-          </w:p>
-        </w:tc>
-      </w:tr>
-      <w:tr>
-        <w:tc>
-          <w:tcPr>
-            <w:tcW w:type="dxa" w:w="1037"/>
-          </w:tcPr>
-          <w:p>
-            <w:pPr>
-              <w:spacing w:after="20"/>
-            </w:pPr>
-            <w:r>
-              <w:rPr>
-                <w:rFonts w:ascii="Times New Roman" w:hAnsi="Times New Roman"/>
-                <w:sz w:val="15"/>
-              </w:rPr>
-              <w:t>Workload</w:t>
-            </w:r>
-          </w:p>
-        </w:tc>
-        <w:tc>
-          <w:tcPr>
-            <w:tcW w:type="dxa" w:w="2232"/>
-          </w:tcPr>
-          <w:p>
-            <w:pPr>
-              <w:spacing w:after="20"/>
-            </w:pPr>
-            <w:r>
-              <w:rPr>
-                <w:rFonts w:ascii="Times New Roman" w:hAnsi="Times New Roman"/>
-                <w:sz w:val="15"/>
-              </w:rPr>
-              <w:t>Document source/license or generator; counts, types, sizes, sensitivity</w:t>
-            </w:r>
-          </w:p>
-        </w:tc>
-        <w:tc>
-          <w:tcPr>
-            <w:tcW w:type="dxa" w:w="1699"/>
-          </w:tcPr>
-          <w:p>
-            <w:pPr>
-              <w:spacing w:after="20"/>
-            </w:pPr>
-            <w:r>
-              <w:rPr>
-                <w:rFonts w:ascii="Times New Roman" w:hAnsi="Times New Roman"/>
-                <w:sz w:val="15"/>
-              </w:rPr>
-              <w:t>Corpus manifest and test cases</w:t>
-            </w:r>
-          </w:p>
-        </w:tc>
-      </w:tr>
-      <w:tr>
-        <w:tc>
-          <w:tcPr>
-            <w:tcW w:type="dxa" w:w="1037"/>
-          </w:tcPr>
-          <w:p>
-            <w:pPr>
-              <w:spacing w:after="20"/>
-            </w:pPr>
-            <w:r>
-              <w:rPr>
-                <w:rFonts w:ascii="Times New Roman" w:hAnsi="Times New Roman"/>
-                <w:sz w:val="15"/>
-              </w:rPr>
-              <w:t>Baselines</w:t>
-            </w:r>
-          </w:p>
-        </w:tc>
-        <w:tc>
-          <w:tcPr>
-            <w:tcW w:type="dxa" w:w="2232"/>
-          </w:tcPr>
-          <w:p>
-            <w:pPr>
-              <w:spacing w:after="20"/>
-            </w:pPr>
-            <w:r>
-              <w:rPr>
-                <w:rFonts w:ascii="Times New Roman" w:hAnsi="Times New Roman"/>
-                <w:sz w:val="15"/>
-              </w:rPr>
-              <w:t>Central audit; ledger without decision events; recent compatible framework</w:t>
-            </w:r>
-          </w:p>
-        </w:tc>
-        <w:tc>
-          <w:tcPr>
-            <w:tcW w:type="dxa" w:w="1699"/>
-          </w:tcPr>
-          <w:p>
-            <w:pPr>
-              <w:spacing w:after="20"/>
-            </w:pPr>
-            <w:r>
-              <w:rPr>
-                <w:rFonts w:ascii="Times New Roman" w:hAnsi="Times New Roman"/>
-                <w:sz w:val="15"/>
-              </w:rPr>
-              <w:t>Matched comparison</w:t>
-            </w:r>
-          </w:p>
-        </w:tc>
-      </w:tr>
-      <w:tr>
-        <w:tc>
-          <w:tcPr>
-            <w:tcW w:type="dxa" w:w="1037"/>
-          </w:tcPr>
-          <w:p>
-            <w:pPr>
-              <w:spacing w:after="20"/>
-            </w:pPr>
-            <w:r>
-              <w:rPr>
-                <w:rFonts w:ascii="Times New Roman" w:hAnsi="Times New Roman"/>
-                <w:sz w:val="15"/>
-              </w:rPr>
-              <w:t>Latency</w:t>
-            </w:r>
-          </w:p>
-        </w:tc>
-        <w:tc>
-          <w:tcPr>
-            <w:tcW w:type="dxa" w:w="2232"/>
-          </w:tcPr>
-          <w:p>
-            <w:pPr>
-              <w:spacing w:after="20"/>
-            </w:pPr>
-            <w:r>
-              <w:rPr>
-                <w:rFonts w:ascii="Times New Roman" w:hAnsi="Times New Roman"/>
-                <w:sz w:val="15"/>
-              </w:rPr>
-              <w:t>Repeated registration/retrieval by size and concurrency</w:t>
-            </w:r>
-          </w:p>
-        </w:tc>
-        <w:tc>
-          <w:tcPr>
-            <w:tcW w:type="dxa" w:w="1699"/>
-          </w:tcPr>
-          <w:p>
-            <w:pPr>
-              <w:spacing w:after="20"/>
-            </w:pPr>
-            <w:r>
-              <w:rPr>
-                <w:rFonts w:ascii="Times New Roman" w:hAnsi="Times New Roman"/>
-                <w:sz w:val="15"/>
-              </w:rPr>
-              <w:t>Median, p95, 95% CI, stage breakdown</w:t>
-            </w:r>
-          </w:p>
-        </w:tc>
-      </w:tr>
-      <w:tr>
-        <w:tc>
-          <w:tcPr>
-            <w:tcW w:type="dxa" w:w="1037"/>
-          </w:tcPr>
-          <w:p>
-            <w:pPr>
-              <w:spacing w:after="20"/>
-            </w:pPr>
-            <w:r>
-              <w:rPr>
-                <w:rFonts w:ascii="Times New Roman" w:hAnsi="Times New Roman"/>
-                <w:sz w:val="15"/>
-              </w:rPr>
-              <w:t>Throughput/cost</w:t>
-            </w:r>
-          </w:p>
-        </w:tc>
-        <w:tc>
-          <w:tcPr>
-            <w:tcW w:type="dxa" w:w="2232"/>
-          </w:tcPr>
-          <w:p>
-            <w:pPr>
-              <w:spacing w:after="20"/>
-            </w:pPr>
-            <w:r>
-              <w:rPr>
-                <w:rFonts w:ascii="Times New Roman" w:hAnsi="Times New Roman"/>
-                <w:sz w:val="15"/>
-              </w:rPr>
-              <w:t>Vary clients and event volume</w:t>
-            </w:r>
-          </w:p>
-        </w:tc>
-        <w:tc>
-          <w:tcPr>
-            <w:tcW w:type="dxa" w:w="1699"/>
-          </w:tcPr>
-          <w:p>
-            <w:pPr>
-              <w:spacing w:after="20"/>
-            </w:pPr>
-            <w:r>
-              <w:rPr>
-                <w:rFonts w:ascii="Times New Roman" w:hAnsi="Times New Roman"/>
-                <w:sz w:val="15"/>
-              </w:rPr>
-              <w:t>Transactions/s, commit delay, bytes/event, ledger growth</w:t>
-            </w:r>
-          </w:p>
-        </w:tc>
-      </w:tr>
-      <w:tr>
-        <w:tc>
-          <w:tcPr>
-            <w:tcW w:type="dxa" w:w="1037"/>
-          </w:tcPr>
-          <w:p>
-            <w:pPr>
-              <w:spacing w:after="20"/>
-            </w:pPr>
-            <w:r>
-              <w:rPr>
-                <w:rFonts w:ascii="Times New Roman" w:hAnsi="Times New Roman"/>
-                <w:sz w:val="15"/>
-              </w:rPr>
-              <w:t>Ablation</w:t>
-            </w:r>
-          </w:p>
-        </w:tc>
-        <w:tc>
-          <w:tcPr>
-            <w:tcW w:type="dxa" w:w="2232"/>
-          </w:tcPr>
-          <w:p>
-            <w:pPr>
-              <w:spacing w:after="20"/>
-            </w:pPr>
-            <w:r>
-              <w:rPr>
-                <w:rFonts w:ascii="Times New Roman" w:hAnsi="Times New Roman"/>
-                <w:sz w:val="15"/>
-              </w:rPr>
-              <w:t>Remove one major control at a time</w:t>
-            </w:r>
-          </w:p>
-        </w:tc>
-        <w:tc>
-          <w:tcPr>
-            <w:tcW w:type="dxa" w:w="1699"/>
-          </w:tcPr>
-          <w:p>
-            <w:pPr>
-              <w:spacing w:after="20"/>
-            </w:pPr>
-            <w:r>
-              <w:rPr>
-                <w:rFonts w:ascii="Times New Roman" w:hAnsi="Times New Roman"/>
-                <w:sz w:val="15"/>
-              </w:rPr>
-              <w:t>Security and cost effect</w:t>
-            </w:r>
-          </w:p>
-        </w:tc>
-      </w:tr>
-      <w:tr>
-        <w:tc>
-          <w:tcPr>
-            <w:tcW w:type="dxa" w:w="1037"/>
-          </w:tcPr>
-          <w:p>
-            <w:pPr>
-              <w:spacing w:after="20"/>
-            </w:pPr>
-            <w:r>
-              <w:rPr>
-                <w:rFonts w:ascii="Times New Roman" w:hAnsi="Times New Roman"/>
-                <w:sz w:val="15"/>
-              </w:rPr>
-              <w:t>Failures</w:t>
-            </w:r>
-          </w:p>
-        </w:tc>
-        <w:tc>
-          <w:tcPr>
-            <w:tcW w:type="dxa" w:w="2232"/>
-          </w:tcPr>
-          <w:p>
-            <w:pPr>
-              <w:spacing w:after="20"/>
-            </w:pPr>
-            <w:r>
-              <w:rPr>
-                <w:rFonts w:ascii="Times New Roman" w:hAnsi="Times New Roman"/>
-                <w:sz w:val="15"/>
-              </w:rPr>
-              <w:t>Restart services; inject delay; vary formats/sizes</w:t>
-            </w:r>
-          </w:p>
-        </w:tc>
-        <w:tc>
-          <w:tcPr>
-            <w:tcW w:type="dxa" w:w="1699"/>
-          </w:tcPr>
-          <w:p>
-            <w:pPr>
-              <w:spacing w:after="20"/>
-            </w:pPr>
-            <w:r>
-              <w:rPr>
-                <w:rFonts w:ascii="Times New Roman" w:hAnsi="Times New Roman"/>
-                <w:sz w:val="15"/>
-              </w:rPr>
-              <w:t>Failure modes and recovery</w:t>
-            </w:r>
-          </w:p>
-        </w:tc>
-      </w:tr>
-      <w:tr>
-        <w:tc>
-          <w:tcPr>
-            <w:tcW w:type="dxa" w:w="1037"/>
-          </w:tcPr>
-          <w:p>
-            <w:pPr>
-              <w:spacing w:after="20"/>
-            </w:pPr>
-            <w:r>
-              <w:rPr>
-                <w:rFonts w:ascii="Times New Roman" w:hAnsi="Times New Roman"/>
-                <w:sz w:val="15"/>
-              </w:rPr>
-              <w:t>Privacy</w:t>
-            </w:r>
-          </w:p>
-        </w:tc>
-        <w:tc>
-          <w:tcPr>
-            <w:tcW w:type="dxa" w:w="2232"/>
-          </w:tcPr>
-          <w:p>
-            <w:pPr>
-              <w:spacing w:after="20"/>
-            </w:pPr>
-            <w:r>
-              <w:rPr>
-                <w:rFonts w:ascii="Times New Roman" w:hAnsi="Times New Roman"/>
-                <w:sz w:val="15"/>
-              </w:rPr>
-              <w:t>Inventory fields and test linkage/inference</w:t>
-            </w:r>
-          </w:p>
-        </w:tc>
-        <w:tc>
-          <w:tcPr>
-            <w:tcW w:type="dxa" w:w="1699"/>
-          </w:tcPr>
-          <w:p>
-            <w:pPr>
-              <w:spacing w:after="20"/>
-            </w:pPr>
-            <w:r>
-              <w:rPr>
-                <w:rFonts w:ascii="Times New Roman" w:hAnsi="Times New Roman"/>
-                <w:sz w:val="15"/>
-              </w:rPr>
-              <w:t>Threat-specific leakage</w:t>
-            </w:r>
-          </w:p>
-        </w:tc>
-      </w:tr>
-      <w:tr>
-        <w:tc>
-          <w:tcPr>
-            <w:tcW w:type="dxa" w:w="1037"/>
-          </w:tcPr>
-          <w:p>
-            <w:pPr>
-              <w:spacing w:after="20"/>
-            </w:pPr>
-            <w:r>
-              <w:rPr>
-                <w:rFonts w:ascii="Times New Roman" w:hAnsi="Times New Roman"/>
-                <w:sz w:val="15"/>
-              </w:rPr>
-              <w:t>Reproducibility</w:t>
-            </w:r>
-          </w:p>
-        </w:tc>
-        <w:tc>
-          <w:tcPr>
-            <w:tcW w:type="dxa" w:w="2232"/>
-          </w:tcPr>
-          <w:p>
-            <w:pPr>
-              <w:spacing w:after="20"/>
-            </w:pPr>
-            <w:r>
-              <w:rPr>
-                <w:rFonts w:ascii="Times New Roman" w:hAnsi="Times New Roman"/>
-                <w:sz w:val="15"/>
-              </w:rPr>
-              <w:t>Publish code/config/versions/raw CSV/scripts</w:t>
-            </w:r>
-          </w:p>
-        </w:tc>
-        <w:tc>
-          <w:tcPr>
-            <w:tcW w:type="dxa" w:w="1699"/>
-          </w:tcPr>
-          <w:p>
-            <w:pPr>
-              <w:spacing w:after="20"/>
-            </w:pPr>
-            <w:r>
-              <w:rPr>
-                <w:rFonts w:ascii="Times New Roman" w:hAnsi="Times New Roman"/>
-                <w:sz w:val="15"/>
-              </w:rPr>
-              <w:t>Repository and setup steps</w:t>
-            </w:r>
-          </w:p>
-        </w:tc>
-      </w:tr>
-    </w:tbl>
-    <w:p/>
-    <w:p>
-      <w:pPr>
-        <w:pStyle w:val="Heading2"/>
-      </w:pPr>
-      <w:r>
-        <w:t>E. Limitations and validity threats</w:t>
-      </w:r>
-    </w:p>
-    <w:p>
-      <w:r>
-        <w:t>This evaluation is based on an aggregate report, not source code, raw outputs, environment logs, or independent reruns of the application. One deployment and one suite run cannot establish statistical error rates or generalization; missing hardware, dependency, and Fabric endorsement details also limit reproducibility. The tests do not cover administrator compromise, organizational collusion, deletion or replay, key or nonce misuse, compromised clients, service recovery, or metadata inference. A ledger can make recorded events auditable, but cannot prove that source events were true. These properties remain untested.</w:t>
+        <w:t>A separate microbenchmark was carried out using SHA-256 and AES-256-GCM. This was carried out for 3 warmups and 30 runs. Sizes of 1KiB, 64KiB, 1MiB and 10MiB were used. The median timing for SHA-256 with 10MiB was 5.532ms (p95: 5.977ms). The median encryption time for AES-GCM was 5.119ms, median decryption time was 5.732ms and median time for encryption/decryption was 10.991ms (p95: 12.511ms). All 30 runs for each size rejected the tampered ciphertext. The output from decryption matched the input. This was carried out on Windows 11 with Python 3.12.14 and cryptography 50.0.2. Details of the host and raw data can be found in the metadata and CSV. This only measures the local primitives and does not take into account FastAPI, MinIO, Fabric, database, network or baseline. Do not interpret this as performance of the complete system.</w:t>
       </w:r>
     </w:p>
     <w:p>
@@ -3714,12 +3151,12 @@
         <w:pStyle w:val="Heading1"/>
       </w:pPr>
       <w:r>
-        <w:t>VII. CONCLUSION AND FUTURE WORK</w:t>
+        <w:t>C. Conclusions</w:t>
       </w:r>
     </w:p>
     <w:p>
       <w:r>
-        <w:t>PrivCloud-Chain brings together a FastAPI dashboard, user authentication, AES-256-GCM encryption, SHA-256 fingerprints, MinIO ciphertext storage, and Hyperledger Fabric custody records. The supplied Verification Center report records 15 of 15 configured checks passing in one run lasting 38.658 s. A separate local benchmark measured cryptographic primitives, and a synthetic 60-event corpus is included for repeatable system tests. Neither artifact replaces application-level comparisons. The three proposed baselines and four ablations remain to be run against the actual source code, which was not available for this revision. Before making broader claims, the team should publish the implementation and configuration, document key management and ledger visibility, measure matched baselines under varied file sizes and concurrency, preserve raw repeated-trial data, and test failures, recovery, and metadata exposure. The present results support a bounded functional demonstration, not a conclusion about comparative security, privacy, or scalability.</w:t>
+        <w:t>In summary, it has been shown that the integrated deployment meets the claims made in the verification centre run provided. The suite covers authorised and denied scenarios. The MinIO and Fabric are integrated.</w:t>
       </w:r>
     </w:p>
     <w:p>

</xml_diff>